<commit_message>
Update checkpoint 1 and 2
</commit_message>
<xml_diff>
--- a/Cloud_ML_Lab_Proposal_Summary_slm.docx
+++ b/Cloud_ML_Lab_Proposal_Summary_slm.docx
@@ -1983,6 +1983,12 @@
         </w:rPr>
         <w:t>The storage location: Students can choose either to set up a persistent volume or to use an Amazon S3 bucket to store the trained models.</w:t>
       </w:r>
+      <w:r>
+        <w:rPr>
+          <w:lang w:eastAsia="zh-CN"/>
+        </w:rPr>
+        <w:t xml:space="preserve"> ()</w:t>
+      </w:r>
     </w:p>
     <w:p>
       <w:pPr>
@@ -1999,6 +2005,12 @@
         </w:rPr>
         <w:lastRenderedPageBreak/>
         <w:t>The fine-tuning data: Students can summarize their own training text or use provided simple training text. This can help students visualize the influence of the dataset on the tuning speed and accuracy.</w:t>
+      </w:r>
+      <w:r>
+        <w:rPr>
+          <w:lang w:eastAsia="zh-CN"/>
+        </w:rPr>
+        <w:t xml:space="preserve"> ()</w:t>
       </w:r>
     </w:p>
     <w:p>
@@ -2125,6 +2137,12 @@
         </w:rPr>
         <w:t xml:space="preserve"> building.</w:t>
       </w:r>
+      <w:r>
+        <w:rPr>
+          <w:lang w:eastAsia="zh-CN"/>
+        </w:rPr>
+        <w:t xml:space="preserve"> </w:t>
+      </w:r>
     </w:p>
     <w:p>
       <w:pPr>
@@ -2175,6 +2193,16 @@
         </w:rPr>
         <w:t xml:space="preserve">for parsing. </w:t>
       </w:r>
+    </w:p>
+    <w:p>
+      <w:pPr>
+        <w:ind w:left="360"/>
+      </w:pPr>
+    </w:p>
+    <w:p>
+      <w:pPr>
+        <w:ind w:left="360"/>
+      </w:pPr>
     </w:p>
     <w:sectPr>
       <w:pgSz w:w="12240" w:h="15840"/>

</xml_diff>

<commit_message>
Update check point documentation
</commit_message>
<xml_diff>
--- a/Cloud_ML_Lab_Proposal_Summary_slm.docx
+++ b/Cloud_ML_Lab_Proposal_Summary_slm.docx
@@ -386,6 +386,30 @@
           <w:lang w:eastAsia="zh-CN"/>
         </w:rPr>
         <w:t>such that it can run the inference multiple times.</w:t>
+      </w:r>
+      <w:r>
+        <w:rPr>
+          <w:rFonts w:hint="eastAsia"/>
+          <w:lang w:eastAsia="zh-CN"/>
+        </w:rPr>
+        <w:t xml:space="preserve"> (</w:t>
+      </w:r>
+      <w:hyperlink r:id="rId6" w:history="1">
+        <w:r>
+          <w:rPr>
+            <w:rStyle w:val="Hyperlink"/>
+            <w:rFonts w:hint="eastAsia"/>
+            <w:lang w:eastAsia="zh-CN"/>
+          </w:rPr>
+          <w:t>Canva link</w:t>
+        </w:r>
+      </w:hyperlink>
+      <w:r>
+        <w:rPr>
+          <w:rFonts w:hint="eastAsia"/>
+          <w:lang w:eastAsia="zh-CN"/>
+        </w:rPr>
+        <w:t>)</w:t>
       </w:r>
     </w:p>
     <w:p>
@@ -412,7 +436,7 @@
                     <pic:cNvPicPr/>
                   </pic:nvPicPr>
                   <pic:blipFill>
-                    <a:blip r:embed="rId6"/>
+                    <a:blip r:embed="rId7"/>
                     <a:stretch>
                       <a:fillRect/>
                     </a:stretch>
@@ -2197,11 +2221,19 @@
     <w:p>
       <w:pPr>
         <w:ind w:left="360"/>
+        <w:rPr>
+          <w:rFonts w:hint="eastAsia"/>
+          <w:lang w:eastAsia="zh-CN"/>
+        </w:rPr>
       </w:pPr>
     </w:p>
     <w:p>
       <w:pPr>
         <w:ind w:left="360"/>
+        <w:rPr>
+          <w:rFonts w:hint="eastAsia"/>
+          <w:lang w:eastAsia="zh-CN"/>
+        </w:rPr>
       </w:pPr>
     </w:p>
     <w:sectPr>
@@ -14004,6 +14036,29 @@
       </w:tcPr>
     </w:tblStylePr>
   </w:style>
+  <w:style w:type="character" w:styleId="Hyperlink">
+    <w:name w:val="Hyperlink"/>
+    <w:basedOn w:val="DefaultParagraphFont"/>
+    <w:uiPriority w:val="99"/>
+    <w:unhideWhenUsed/>
+    <w:rsid w:val="00584F25"/>
+    <w:rPr>
+      <w:color w:val="0000FF" w:themeColor="hyperlink"/>
+      <w:u w:val="single"/>
+    </w:rPr>
+  </w:style>
+  <w:style w:type="character" w:styleId="UnresolvedMention">
+    <w:name w:val="Unresolved Mention"/>
+    <w:basedOn w:val="DefaultParagraphFont"/>
+    <w:uiPriority w:val="99"/>
+    <w:semiHidden/>
+    <w:unhideWhenUsed/>
+    <w:rsid w:val="00584F25"/>
+    <w:rPr>
+      <w:color w:val="605E5C"/>
+      <w:shd w:val="clear" w:color="auto" w:fill="E1DFDD"/>
+    </w:rPr>
+  </w:style>
 </w:styles>
 </file>
 

</xml_diff>